<commit_message>
tabla nula para plat
</commit_message>
<xml_diff>
--- a/app/templates/tabla_plataforma.docx
+++ b/app/templates/tabla_plataforma.docx
@@ -7,20 +7,30 @@
         <w:pStyle w:val="Normal"/>
         <w:widowControl w:val="false"/>
         <w:spacing w:before="0" w:after="0"/>
-        <w:ind w:hanging="0"/>
+        <w:ind w:left="0" w:right="0" w:hanging="0"/>
         <w:rPr>
-          <w:rFonts w:cs="Arial"/>
           <w:b/>
           <w:b/>
-          <w:lang w:val="es-ES"/>
         </w:rPr>
       </w:pPr>
       <w:r>
         <w:rPr>
-          <w:rFonts w:cs="Arial"/>
           <w:b/>
-          <w:lang w:val="es-ES"/>
         </w:rPr>
+        <w:t>{{na1-</w:t>
+      </w:r>
+      <w:r>
+        <w:rPr>
+          <w:b/>
+        </w:rPr>
+        <w:t>1</w:t>
+      </w:r>
+      <w:r>
+        <w:rPr>
+          <w:b/>
+        </w:rPr>
+        <w:t xml:space="preserve">}}          </w:t>
+        <w:tab/>
       </w:r>
     </w:p>
     <w:p>
@@ -2136,7 +2146,10 @@
               </w:rPr>
             </w:pPr>
             <w:r>
-              <w:rPr/>
+              <w:rPr>
+                <w:b w:val="false"/>
+                <w:bCs w:val="false"/>
+              </w:rPr>
             </w:r>
           </w:p>
         </w:tc>
@@ -2219,24 +2232,35 @@
         <w:pStyle w:val="Normal"/>
         <w:widowControl w:val="false"/>
         <w:spacing w:before="0" w:after="0"/>
-        <w:ind w:hanging="0"/>
+        <w:ind w:left="0" w:right="0" w:hanging="0"/>
         <w:rPr>
-          <w:rFonts w:cs="Arial"/>
           <w:b/>
           <w:b/>
-          <w:sz w:val="22"/>
-          <w:szCs w:val="22"/>
-          <w:lang w:val="es-ES"/>
         </w:rPr>
       </w:pPr>
       <w:r>
         <w:rPr>
-          <w:rFonts w:cs="Arial"/>
           <w:b/>
-          <w:sz w:val="22"/>
-          <w:szCs w:val="22"/>
-          <w:lang w:val="es-ES"/>
         </w:rPr>
+        <w:t xml:space="preserve">{{na1-2}}          </w:t>
+        <w:tab/>
+      </w:r>
+    </w:p>
+    <w:p>
+      <w:pPr>
+        <w:pStyle w:val="Normal"/>
+        <w:widowControl w:val="false"/>
+        <w:spacing w:before="0" w:after="0"/>
+        <w:ind w:left="0" w:right="0" w:hanging="0"/>
+        <w:rPr>
+          <w:b/>
+          <w:b/>
+        </w:rPr>
+      </w:pPr>
+      <w:r>
+        <w:rPr/>
+        <w:tab/>
+        <w:t>{{na2-1}}</w:t>
       </w:r>
     </w:p>
     <w:p>
@@ -4551,7 +4575,10 @@
               </w:rPr>
             </w:pPr>
             <w:r>
-              <w:rPr/>
+              <w:rPr>
+                <w:b w:val="false"/>
+                <w:bCs w:val="false"/>
+              </w:rPr>
             </w:r>
           </w:p>
         </w:tc>
@@ -4634,24 +4661,55 @@
         <w:pStyle w:val="Normal"/>
         <w:widowControl w:val="false"/>
         <w:spacing w:before="0" w:after="0"/>
-        <w:ind w:hanging="0"/>
+        <w:ind w:left="0" w:right="0" w:hanging="0"/>
         <w:rPr>
-          <w:rFonts w:cs="Arial"/>
           <w:b/>
           <w:b/>
-          <w:sz w:val="22"/>
-          <w:szCs w:val="22"/>
-          <w:lang w:val="es-ES"/>
         </w:rPr>
       </w:pPr>
       <w:r>
         <w:rPr>
-          <w:rFonts w:cs="Arial"/>
           <w:b/>
-          <w:sz w:val="22"/>
-          <w:szCs w:val="22"/>
-          <w:lang w:val="es-ES"/>
         </w:rPr>
+        <w:t>{{na</w:t>
+      </w:r>
+      <w:r>
+        <w:rPr>
+          <w:b/>
+        </w:rPr>
+        <w:t>2</w:t>
+      </w:r>
+      <w:r>
+        <w:rPr>
+          <w:b/>
+        </w:rPr>
+        <w:t xml:space="preserve">-2}}          </w:t>
+        <w:tab/>
+      </w:r>
+    </w:p>
+    <w:p>
+      <w:pPr>
+        <w:pStyle w:val="Normal"/>
+        <w:widowControl w:val="false"/>
+        <w:spacing w:before="0" w:after="0"/>
+        <w:ind w:left="0" w:right="0" w:hanging="0"/>
+        <w:rPr>
+          <w:b/>
+          <w:b/>
+        </w:rPr>
+      </w:pPr>
+      <w:r>
+        <w:rPr/>
+        <w:tab/>
+        <w:t>{{na</w:t>
+      </w:r>
+      <w:r>
+        <w:rPr/>
+        <w:t>3</w:t>
+      </w:r>
+      <w:r>
+        <w:rPr/>
+        <w:t>-1}}</w:t>
       </w:r>
     </w:p>
     <w:p>
@@ -6129,7 +6187,10 @@
               </w:rPr>
             </w:pPr>
             <w:r>
-              <w:rPr/>
+              <w:rPr>
+                <w:b w:val="false"/>
+                <w:bCs w:val="false"/>
+              </w:rPr>
             </w:r>
           </w:p>
         </w:tc>
@@ -6212,24 +6273,55 @@
         <w:pStyle w:val="Normal"/>
         <w:widowControl w:val="false"/>
         <w:spacing w:before="0" w:after="0"/>
-        <w:ind w:hanging="0"/>
+        <w:ind w:left="0" w:right="0" w:hanging="0"/>
         <w:rPr>
-          <w:rFonts w:cs="Arial"/>
           <w:b/>
           <w:b/>
-          <w:sz w:val="22"/>
-          <w:szCs w:val="22"/>
-          <w:lang w:val="es-ES"/>
         </w:rPr>
       </w:pPr>
       <w:r>
         <w:rPr>
-          <w:rFonts w:cs="Arial"/>
           <w:b/>
-          <w:sz w:val="22"/>
-          <w:szCs w:val="22"/>
-          <w:lang w:val="es-ES"/>
         </w:rPr>
+        <w:t>{{na</w:t>
+      </w:r>
+      <w:r>
+        <w:rPr>
+          <w:b/>
+        </w:rPr>
+        <w:t>3</w:t>
+      </w:r>
+      <w:r>
+        <w:rPr>
+          <w:b/>
+        </w:rPr>
+        <w:t xml:space="preserve">-2}}          </w:t>
+        <w:tab/>
+      </w:r>
+    </w:p>
+    <w:p>
+      <w:pPr>
+        <w:pStyle w:val="Normal"/>
+        <w:widowControl w:val="false"/>
+        <w:spacing w:before="0" w:after="0"/>
+        <w:ind w:left="0" w:right="0" w:hanging="0"/>
+        <w:rPr>
+          <w:b/>
+          <w:b/>
+        </w:rPr>
+      </w:pPr>
+      <w:r>
+        <w:rPr/>
+        <w:tab/>
+        <w:t>{{na</w:t>
+      </w:r>
+      <w:r>
+        <w:rPr/>
+        <w:t>4</w:t>
+      </w:r>
+      <w:r>
+        <w:rPr/>
+        <w:t>-1}}</w:t>
       </w:r>
     </w:p>
     <w:p>
@@ -7918,7 +8010,10 @@
               </w:rPr>
             </w:pPr>
             <w:r>
-              <w:rPr/>
+              <w:rPr>
+                <w:b w:val="false"/>
+                <w:bCs w:val="false"/>
+              </w:rPr>
             </w:r>
           </w:p>
         </w:tc>
@@ -8001,24 +8096,55 @@
         <w:pStyle w:val="Normal"/>
         <w:widowControl w:val="false"/>
         <w:spacing w:before="0" w:after="0"/>
-        <w:ind w:hanging="0"/>
+        <w:ind w:left="0" w:right="0" w:hanging="0"/>
         <w:rPr>
-          <w:rFonts w:cs="Arial"/>
           <w:b/>
           <w:b/>
-          <w:sz w:val="22"/>
-          <w:szCs w:val="22"/>
-          <w:lang w:val="es-ES"/>
         </w:rPr>
       </w:pPr>
       <w:r>
         <w:rPr>
-          <w:rFonts w:cs="Arial"/>
           <w:b/>
-          <w:sz w:val="22"/>
-          <w:szCs w:val="22"/>
-          <w:lang w:val="es-ES"/>
         </w:rPr>
+        <w:t>{{na</w:t>
+      </w:r>
+      <w:r>
+        <w:rPr>
+          <w:b/>
+        </w:rPr>
+        <w:t>4</w:t>
+      </w:r>
+      <w:r>
+        <w:rPr>
+          <w:b/>
+        </w:rPr>
+        <w:t xml:space="preserve">-2}}          </w:t>
+        <w:tab/>
+      </w:r>
+    </w:p>
+    <w:p>
+      <w:pPr>
+        <w:pStyle w:val="Normal"/>
+        <w:widowControl w:val="false"/>
+        <w:spacing w:before="0" w:after="0"/>
+        <w:ind w:left="0" w:right="0" w:hanging="0"/>
+        <w:rPr>
+          <w:b/>
+          <w:b/>
+        </w:rPr>
+      </w:pPr>
+      <w:r>
+        <w:rPr/>
+        <w:tab/>
+        <w:t>{{na</w:t>
+      </w:r>
+      <w:r>
+        <w:rPr/>
+        <w:t>5</w:t>
+      </w:r>
+      <w:r>
+        <w:rPr/>
+        <w:t>-1}}</w:t>
       </w:r>
     </w:p>
     <w:p>
@@ -10127,7 +10253,10 @@
               </w:rPr>
             </w:pPr>
             <w:r>
-              <w:rPr/>
+              <w:rPr>
+                <w:b w:val="false"/>
+                <w:bCs w:val="false"/>
+              </w:rPr>
             </w:r>
           </w:p>
         </w:tc>
@@ -10210,24 +10339,55 @@
         <w:pStyle w:val="Normal"/>
         <w:widowControl w:val="false"/>
         <w:spacing w:before="0" w:after="0"/>
-        <w:ind w:hanging="0"/>
+        <w:ind w:left="0" w:right="0" w:hanging="0"/>
         <w:rPr>
-          <w:rFonts w:cs="Arial"/>
           <w:b/>
           <w:b/>
-          <w:sz w:val="22"/>
-          <w:szCs w:val="22"/>
-          <w:lang w:val="es-ES"/>
         </w:rPr>
       </w:pPr>
       <w:r>
         <w:rPr>
-          <w:rFonts w:cs="Arial"/>
           <w:b/>
-          <w:sz w:val="22"/>
-          <w:szCs w:val="22"/>
-          <w:lang w:val="es-ES"/>
         </w:rPr>
+        <w:t>{{na</w:t>
+      </w:r>
+      <w:r>
+        <w:rPr>
+          <w:b/>
+        </w:rPr>
+        <w:t>5</w:t>
+      </w:r>
+      <w:r>
+        <w:rPr>
+          <w:b/>
+        </w:rPr>
+        <w:t xml:space="preserve">-2}}          </w:t>
+        <w:tab/>
+      </w:r>
+    </w:p>
+    <w:p>
+      <w:pPr>
+        <w:pStyle w:val="Normal"/>
+        <w:widowControl w:val="false"/>
+        <w:spacing w:before="0" w:after="0"/>
+        <w:ind w:left="0" w:right="0" w:hanging="0"/>
+        <w:rPr>
+          <w:b/>
+          <w:b/>
+        </w:rPr>
+      </w:pPr>
+      <w:r>
+        <w:rPr/>
+        <w:tab/>
+        <w:t>{{na</w:t>
+      </w:r>
+      <w:r>
+        <w:rPr/>
+        <w:t>6</w:t>
+      </w:r>
+      <w:r>
+        <w:rPr/>
+        <w:t>-1}}</w:t>
       </w:r>
     </w:p>
     <w:p>
@@ -12336,7 +12496,10 @@
               </w:rPr>
             </w:pPr>
             <w:r>
-              <w:rPr/>
+              <w:rPr>
+                <w:b w:val="false"/>
+                <w:bCs w:val="false"/>
+              </w:rPr>
             </w:r>
           </w:p>
         </w:tc>
@@ -12419,24 +12582,55 @@
         <w:pStyle w:val="Normal"/>
         <w:widowControl w:val="false"/>
         <w:spacing w:before="0" w:after="0"/>
-        <w:ind w:hanging="0"/>
+        <w:ind w:left="0" w:right="0" w:hanging="0"/>
         <w:rPr>
-          <w:rFonts w:cs="Arial"/>
           <w:b/>
           <w:b/>
-          <w:sz w:val="22"/>
-          <w:szCs w:val="22"/>
-          <w:lang w:val="es-ES"/>
         </w:rPr>
       </w:pPr>
       <w:r>
         <w:rPr>
-          <w:rFonts w:cs="Arial"/>
           <w:b/>
-          <w:sz w:val="22"/>
-          <w:szCs w:val="22"/>
-          <w:lang w:val="es-ES"/>
         </w:rPr>
+        <w:t>{{na</w:t>
+      </w:r>
+      <w:r>
+        <w:rPr>
+          <w:b/>
+        </w:rPr>
+        <w:t>6</w:t>
+      </w:r>
+      <w:r>
+        <w:rPr>
+          <w:b/>
+        </w:rPr>
+        <w:t xml:space="preserve">-2}}          </w:t>
+        <w:tab/>
+      </w:r>
+    </w:p>
+    <w:p>
+      <w:pPr>
+        <w:pStyle w:val="Normal"/>
+        <w:widowControl w:val="false"/>
+        <w:spacing w:before="0" w:after="0"/>
+        <w:ind w:left="0" w:right="0" w:hanging="0"/>
+        <w:rPr>
+          <w:b/>
+          <w:b/>
+        </w:rPr>
+      </w:pPr>
+      <w:r>
+        <w:rPr/>
+        <w:tab/>
+        <w:t>{{na</w:t>
+      </w:r>
+      <w:r>
+        <w:rPr/>
+        <w:t>7</w:t>
+      </w:r>
+      <w:r>
+        <w:rPr/>
+        <w:t>-1}}</w:t>
       </w:r>
     </w:p>
     <w:p>
@@ -14127,7 +14321,10 @@
               </w:rPr>
             </w:pPr>
             <w:r>
-              <w:rPr/>
+              <w:rPr>
+                <w:b w:val="false"/>
+                <w:bCs w:val="false"/>
+              </w:rPr>
             </w:r>
           </w:p>
         </w:tc>
@@ -14210,24 +14407,55 @@
         <w:pStyle w:val="Normal"/>
         <w:widowControl w:val="false"/>
         <w:spacing w:before="0" w:after="0"/>
-        <w:ind w:hanging="0"/>
+        <w:ind w:left="0" w:right="0" w:hanging="0"/>
         <w:rPr>
-          <w:rFonts w:cs="Arial"/>
           <w:b/>
           <w:b/>
-          <w:sz w:val="22"/>
-          <w:szCs w:val="22"/>
-          <w:lang w:val="es-ES"/>
         </w:rPr>
       </w:pPr>
       <w:r>
         <w:rPr>
-          <w:rFonts w:cs="Arial"/>
           <w:b/>
-          <w:sz w:val="22"/>
-          <w:szCs w:val="22"/>
-          <w:lang w:val="es-ES"/>
         </w:rPr>
+        <w:t>{{na</w:t>
+      </w:r>
+      <w:r>
+        <w:rPr>
+          <w:b/>
+        </w:rPr>
+        <w:t>7</w:t>
+      </w:r>
+      <w:r>
+        <w:rPr>
+          <w:b/>
+        </w:rPr>
+        <w:t xml:space="preserve">-2}}          </w:t>
+        <w:tab/>
+      </w:r>
+    </w:p>
+    <w:p>
+      <w:pPr>
+        <w:pStyle w:val="Normal"/>
+        <w:widowControl w:val="false"/>
+        <w:spacing w:before="0" w:after="0"/>
+        <w:ind w:left="0" w:right="0" w:hanging="0"/>
+        <w:rPr>
+          <w:b/>
+          <w:b/>
+        </w:rPr>
+      </w:pPr>
+      <w:r>
+        <w:rPr/>
+        <w:tab/>
+        <w:t>{{na</w:t>
+      </w:r>
+      <w:r>
+        <w:rPr/>
+        <w:t>8</w:t>
+      </w:r>
+      <w:r>
+        <w:rPr/>
+        <w:t>-1}}</w:t>
       </w:r>
     </w:p>
     <w:p>
@@ -15916,7 +16144,10 @@
               </w:rPr>
             </w:pPr>
             <w:r>
-              <w:rPr/>
+              <w:rPr>
+                <w:b w:val="false"/>
+                <w:bCs w:val="false"/>
+              </w:rPr>
             </w:r>
           </w:p>
         </w:tc>
@@ -15999,24 +16230,55 @@
         <w:pStyle w:val="Normal"/>
         <w:widowControl w:val="false"/>
         <w:spacing w:before="0" w:after="0"/>
-        <w:ind w:hanging="0"/>
+        <w:ind w:left="0" w:right="0" w:hanging="0"/>
         <w:rPr>
-          <w:rFonts w:cs="Arial"/>
           <w:b/>
           <w:b/>
-          <w:sz w:val="22"/>
-          <w:szCs w:val="22"/>
-          <w:lang w:val="es-ES"/>
         </w:rPr>
       </w:pPr>
       <w:r>
         <w:rPr>
-          <w:rFonts w:cs="Arial"/>
           <w:b/>
-          <w:sz w:val="22"/>
-          <w:szCs w:val="22"/>
-          <w:lang w:val="es-ES"/>
         </w:rPr>
+        <w:t>{{na</w:t>
+      </w:r>
+      <w:r>
+        <w:rPr>
+          <w:b/>
+        </w:rPr>
+        <w:t>8</w:t>
+      </w:r>
+      <w:r>
+        <w:rPr>
+          <w:b/>
+        </w:rPr>
+        <w:t xml:space="preserve">-2}}          </w:t>
+        <w:tab/>
+      </w:r>
+    </w:p>
+    <w:p>
+      <w:pPr>
+        <w:pStyle w:val="Normal"/>
+        <w:widowControl w:val="false"/>
+        <w:spacing w:before="0" w:after="0"/>
+        <w:ind w:left="0" w:right="0" w:hanging="0"/>
+        <w:rPr>
+          <w:b/>
+          <w:b/>
+        </w:rPr>
+      </w:pPr>
+      <w:r>
+        <w:rPr/>
+        <w:tab/>
+        <w:t>{{na</w:t>
+      </w:r>
+      <w:r>
+        <w:rPr/>
+        <w:t>9</w:t>
+      </w:r>
+      <w:r>
+        <w:rPr/>
+        <w:t>-1}}</w:t>
       </w:r>
     </w:p>
     <w:p>
@@ -18335,7 +18597,10 @@
               </w:rPr>
             </w:pPr>
             <w:r>
-              <w:rPr/>
+              <w:rPr>
+                <w:b w:val="false"/>
+                <w:bCs w:val="false"/>
+              </w:rPr>
             </w:r>
           </w:p>
         </w:tc>
@@ -18443,18 +18708,30 @@
         <w:pStyle w:val="Normal"/>
         <w:widowControl w:val="false"/>
         <w:spacing w:before="0" w:after="0"/>
-        <w:ind w:hanging="0"/>
+        <w:ind w:left="0" w:right="0" w:hanging="0"/>
         <w:rPr>
-          <w:rFonts w:cs="Arial"/>
           <w:b/>
           <w:b/>
-          <w:sz w:val="22"/>
-          <w:szCs w:val="22"/>
-          <w:lang w:val="es-ES"/>
         </w:rPr>
       </w:pPr>
       <w:r>
-        <w:rPr/>
+        <w:rPr>
+          <w:b/>
+        </w:rPr>
+        <w:t>{{na</w:t>
+      </w:r>
+      <w:r>
+        <w:rPr>
+          <w:b/>
+        </w:rPr>
+        <w:t>9</w:t>
+      </w:r>
+      <w:r>
+        <w:rPr>
+          <w:b/>
+        </w:rPr>
+        <w:t xml:space="preserve">-2}}          </w:t>
+        <w:tab/>
       </w:r>
     </w:p>
     <w:sectPr>

</xml_diff>